<commit_message>
5.5 SSU verzija 1.1
</commit_message>
<xml_diff>
--- a/SSU/5.5 SSU.docx
+++ b/SSU/5.5 SSU.docx
@@ -115,15 +115,15 @@
         <w:tblLook w:val="04A0" w:firstRow="1" w:lastRow="0" w:firstColumn="1" w:lastColumn="0" w:noHBand="0" w:noVBand="1"/>
       </w:tblPr>
       <w:tblGrid>
-        <w:gridCol w:w="1839"/>
-        <w:gridCol w:w="1274"/>
+        <w:gridCol w:w="1840"/>
+        <w:gridCol w:w="1273"/>
         <w:gridCol w:w="4252"/>
         <w:gridCol w:w="1985"/>
       </w:tblGrid>
       <w:tr>
         <w:tc>
           <w:tcPr>
-            <w:tcW w:w="1838" w:type="dxa"/>
+            <w:tcW w:w="1839" w:type="dxa"/>
             <w:tcBorders>
               <w:top w:val="single" w:sz="4" w:space="0" w:color="000000"/>
               <w:left w:val="single" w:sz="4" w:space="0" w:color="000000"/>
@@ -153,7 +153,7 @@
         </w:tc>
         <w:tc>
           <w:tcPr>
-            <w:tcW w:w="1274" w:type="dxa"/>
+            <w:tcW w:w="1273" w:type="dxa"/>
             <w:tcBorders>
               <w:top w:val="single" w:sz="4" w:space="0" w:color="000000"/>
               <w:left w:val="single" w:sz="4" w:space="0" w:color="000000"/>
@@ -245,7 +245,7 @@
       <w:tr>
         <w:tc>
           <w:tcPr>
-            <w:tcW w:w="1838" w:type="dxa"/>
+            <w:tcW w:w="1839" w:type="dxa"/>
             <w:tcBorders>
               <w:top w:val="single" w:sz="4" w:space="0" w:color="000000"/>
               <w:left w:val="single" w:sz="4" w:space="0" w:color="000000"/>
@@ -275,7 +275,7 @@
         </w:tc>
         <w:tc>
           <w:tcPr>
-            <w:tcW w:w="1274" w:type="dxa"/>
+            <w:tcW w:w="1273" w:type="dxa"/>
             <w:tcBorders>
               <w:top w:val="single" w:sz="4" w:space="0" w:color="000000"/>
               <w:left w:val="single" w:sz="4" w:space="0" w:color="000000"/>
@@ -367,7 +367,7 @@
       <w:tr>
         <w:tc>
           <w:tcPr>
-            <w:tcW w:w="1838" w:type="dxa"/>
+            <w:tcW w:w="1839" w:type="dxa"/>
             <w:tcBorders>
               <w:top w:val="single" w:sz="4" w:space="0" w:color="000000"/>
               <w:left w:val="single" w:sz="4" w:space="0" w:color="000000"/>
@@ -385,11 +385,133 @@
                 <w:lang w:val="sr-Latn-RS"/>
               </w:rPr>
             </w:pPr>
+            <w:r>
+              <w:rPr>
+                <w:sz w:val="22"/>
+                <w:szCs w:val="22"/>
+                <w:lang w:val="sr-Latn-RS"/>
+              </w:rPr>
+              <w:t>16.4.2026.</w:t>
+            </w:r>
           </w:p>
         </w:tc>
         <w:tc>
           <w:tcPr>
-            <w:tcW w:w="1274" w:type="dxa"/>
+            <w:tcW w:w="1273" w:type="dxa"/>
+            <w:tcBorders>
+              <w:top w:val="single" w:sz="4" w:space="0" w:color="000000"/>
+              <w:left w:val="single" w:sz="4" w:space="0" w:color="000000"/>
+              <w:bottom w:val="single" w:sz="4" w:space="0" w:color="000000"/>
+              <w:right w:val="single" w:sz="4" w:space="0" w:color="000000"/>
+            </w:tcBorders>
+          </w:tcPr>
+          <w:p>
+            <w:pPr>
+              <w:spacing w:after="0" w:line="240" w:lineRule="auto"/>
+              <w:jc w:val="center"/>
+              <w:rPr>
+                <w:sz w:val="22"/>
+                <w:szCs w:val="22"/>
+                <w:lang w:val="sr-Latn-RS"/>
+              </w:rPr>
+            </w:pPr>
+            <w:r>
+              <w:rPr>
+                <w:sz w:val="22"/>
+                <w:szCs w:val="22"/>
+                <w:lang w:val="sr-Latn-RS"/>
+              </w:rPr>
+              <w:t>1.1</w:t>
+            </w:r>
+          </w:p>
+        </w:tc>
+        <w:tc>
+          <w:tcPr>
+            <w:tcW w:w="4252" w:type="dxa"/>
+            <w:tcBorders>
+              <w:top w:val="single" w:sz="4" w:space="0" w:color="000000"/>
+              <w:left w:val="single" w:sz="4" w:space="0" w:color="000000"/>
+              <w:bottom w:val="single" w:sz="4" w:space="0" w:color="000000"/>
+              <w:right w:val="single" w:sz="4" w:space="0" w:color="000000"/>
+            </w:tcBorders>
+          </w:tcPr>
+          <w:p>
+            <w:pPr>
+              <w:spacing w:after="0" w:line="240" w:lineRule="auto"/>
+              <w:jc w:val="center"/>
+              <w:rPr>
+                <w:sz w:val="22"/>
+                <w:szCs w:val="22"/>
+                <w:lang w:val="sr-Latn-RS"/>
+              </w:rPr>
+            </w:pPr>
+            <w:r>
+              <w:rPr>
+                <w:sz w:val="22"/>
+                <w:szCs w:val="22"/>
+                <w:lang w:val="sr-Latn-RS"/>
+              </w:rPr>
+              <w:t>Revidiran način kupovine</w:t>
+            </w:r>
+          </w:p>
+        </w:tc>
+        <w:tc>
+          <w:tcPr>
+            <w:tcW w:w="1985" w:type="dxa"/>
+            <w:tcBorders>
+              <w:top w:val="single" w:sz="4" w:space="0" w:color="000000"/>
+              <w:left w:val="single" w:sz="4" w:space="0" w:color="000000"/>
+              <w:bottom w:val="single" w:sz="4" w:space="0" w:color="000000"/>
+              <w:right w:val="single" w:sz="4" w:space="0" w:color="000000"/>
+            </w:tcBorders>
+          </w:tcPr>
+          <w:p>
+            <w:pPr>
+              <w:spacing w:after="0" w:line="240" w:lineRule="auto"/>
+              <w:jc w:val="center"/>
+              <w:rPr>
+                <w:sz w:val="22"/>
+                <w:szCs w:val="22"/>
+                <w:lang w:val="sr-Latn-RS"/>
+              </w:rPr>
+            </w:pPr>
+            <w:r>
+              <w:rPr>
+                <w:sz w:val="22"/>
+                <w:szCs w:val="22"/>
+                <w:lang w:val="sr-Latn-RS"/>
+              </w:rPr>
+              <w:t>Marko Ćirić</w:t>
+            </w:r>
+          </w:p>
+        </w:tc>
+      </w:tr>
+      <w:tr>
+        <w:tc>
+          <w:tcPr>
+            <w:tcW w:w="1839" w:type="dxa"/>
+            <w:tcBorders>
+              <w:top w:val="single" w:sz="4" w:space="0" w:color="000000"/>
+              <w:left w:val="single" w:sz="4" w:space="0" w:color="000000"/>
+              <w:bottom w:val="single" w:sz="4" w:space="0" w:color="000000"/>
+              <w:right w:val="single" w:sz="4" w:space="0" w:color="000000"/>
+            </w:tcBorders>
+          </w:tcPr>
+          <w:p>
+            <w:pPr>
+              <w:spacing w:after="0" w:line="240" w:lineRule="auto"/>
+              <w:jc w:val="center"/>
+              <w:rPr>
+                <w:sz w:val="22"/>
+                <w:szCs w:val="22"/>
+                <w:lang w:val="sr-Latn-RS"/>
+              </w:rPr>
+            </w:pPr>
+          </w:p>
+        </w:tc>
+        <w:tc>
+          <w:tcPr>
+            <w:tcW w:w="1273" w:type="dxa"/>
             <w:tcBorders>
               <w:top w:val="single" w:sz="4" w:space="0" w:color="000000"/>
               <w:left w:val="single" w:sz="4" w:space="0" w:color="000000"/>
@@ -457,7 +579,7 @@
       <w:tr>
         <w:tc>
           <w:tcPr>
-            <w:tcW w:w="1838" w:type="dxa"/>
+            <w:tcW w:w="1839" w:type="dxa"/>
             <w:tcBorders>
               <w:top w:val="single" w:sz="4" w:space="0" w:color="000000"/>
               <w:left w:val="single" w:sz="4" w:space="0" w:color="000000"/>
@@ -479,7 +601,7 @@
         </w:tc>
         <w:tc>
           <w:tcPr>
-            <w:tcW w:w="1274" w:type="dxa"/>
+            <w:tcW w:w="1273" w:type="dxa"/>
             <w:tcBorders>
               <w:top w:val="single" w:sz="4" w:space="0" w:color="000000"/>
               <w:left w:val="single" w:sz="4" w:space="0" w:color="000000"/>
@@ -544,96 +666,6 @@
           </w:p>
         </w:tc>
       </w:tr>
-      <w:tr>
-        <w:tc>
-          <w:tcPr>
-            <w:tcW w:w="1838" w:type="dxa"/>
-            <w:tcBorders>
-              <w:top w:val="single" w:sz="4" w:space="0" w:color="000000"/>
-              <w:left w:val="single" w:sz="4" w:space="0" w:color="000000"/>
-              <w:bottom w:val="single" w:sz="4" w:space="0" w:color="000000"/>
-              <w:right w:val="single" w:sz="4" w:space="0" w:color="000000"/>
-            </w:tcBorders>
-          </w:tcPr>
-          <w:p>
-            <w:pPr>
-              <w:spacing w:after="0" w:line="240" w:lineRule="auto"/>
-              <w:jc w:val="center"/>
-              <w:rPr>
-                <w:sz w:val="22"/>
-                <w:szCs w:val="22"/>
-                <w:lang w:val="sr-Latn-RS"/>
-              </w:rPr>
-            </w:pPr>
-          </w:p>
-        </w:tc>
-        <w:tc>
-          <w:tcPr>
-            <w:tcW w:w="1274" w:type="dxa"/>
-            <w:tcBorders>
-              <w:top w:val="single" w:sz="4" w:space="0" w:color="000000"/>
-              <w:left w:val="single" w:sz="4" w:space="0" w:color="000000"/>
-              <w:bottom w:val="single" w:sz="4" w:space="0" w:color="000000"/>
-              <w:right w:val="single" w:sz="4" w:space="0" w:color="000000"/>
-            </w:tcBorders>
-          </w:tcPr>
-          <w:p>
-            <w:pPr>
-              <w:spacing w:after="0" w:line="240" w:lineRule="auto"/>
-              <w:jc w:val="center"/>
-              <w:rPr>
-                <w:sz w:val="22"/>
-                <w:szCs w:val="22"/>
-                <w:lang w:val="sr-Latn-RS"/>
-              </w:rPr>
-            </w:pPr>
-          </w:p>
-        </w:tc>
-        <w:tc>
-          <w:tcPr>
-            <w:tcW w:w="4252" w:type="dxa"/>
-            <w:tcBorders>
-              <w:top w:val="single" w:sz="4" w:space="0" w:color="000000"/>
-              <w:left w:val="single" w:sz="4" w:space="0" w:color="000000"/>
-              <w:bottom w:val="single" w:sz="4" w:space="0" w:color="000000"/>
-              <w:right w:val="single" w:sz="4" w:space="0" w:color="000000"/>
-            </w:tcBorders>
-          </w:tcPr>
-          <w:p>
-            <w:pPr>
-              <w:spacing w:after="0" w:line="240" w:lineRule="auto"/>
-              <w:jc w:val="center"/>
-              <w:rPr>
-                <w:sz w:val="22"/>
-                <w:szCs w:val="22"/>
-                <w:lang w:val="sr-Latn-RS"/>
-              </w:rPr>
-            </w:pPr>
-          </w:p>
-        </w:tc>
-        <w:tc>
-          <w:tcPr>
-            <w:tcW w:w="1985" w:type="dxa"/>
-            <w:tcBorders>
-              <w:top w:val="single" w:sz="4" w:space="0" w:color="000000"/>
-              <w:left w:val="single" w:sz="4" w:space="0" w:color="000000"/>
-              <w:bottom w:val="single" w:sz="4" w:space="0" w:color="000000"/>
-              <w:right w:val="single" w:sz="4" w:space="0" w:color="000000"/>
-            </w:tcBorders>
-          </w:tcPr>
-          <w:p>
-            <w:pPr>
-              <w:spacing w:after="0" w:line="240" w:lineRule="auto"/>
-              <w:jc w:val="center"/>
-              <w:rPr>
-                <w:sz w:val="22"/>
-                <w:szCs w:val="22"/>
-                <w:lang w:val="sr-Latn-RS"/>
-              </w:rPr>
-            </w:pPr>
-          </w:p>
-        </w:tc>
-      </w:tr>
     </w:tbl>
     <w:p>
       <w:pPr>
@@ -663,7 +695,7 @@
           <w:sz w:val="24"/>
           <w:szCs w:val="24"/>
         </w:rPr>
-        <w:id w:val="-127556126"/>
+        <w:id w:val="1982420128"/>
         <w:docPartObj>
           <w:docPartGallery w:val="Table of Contents"/>
           <w:docPartUnique/>
@@ -733,7 +765,7 @@
             </w:rPr>
             <w:fldChar w:fldCharType="separate"/>
           </w:r>
-          <w:hyperlink w:anchor="_Toc226837187" w:history="1">
+          <w:hyperlink w:anchor="_Toc227245224" w:history="1">
             <w:r>
               <w:rPr>
                 <w:rStyle w:val="Hyperlink"/>
@@ -781,7 +813,7 @@
                 <w:noProof/>
                 <w:webHidden/>
               </w:rPr>
-              <w:instrText xml:space="preserve"> PAGEREF _Toc226837187 \h </w:instrText>
+              <w:instrText xml:space="preserve"> PAGEREF _Toc227245224 \h </w:instrText>
             </w:r>
             <w:r>
               <w:rPr>
@@ -801,7 +833,7 @@
                 <w:noProof/>
                 <w:webHidden/>
               </w:rPr>
-              <w:t>3</w:t>
+              <w:t>4</w:t>
             </w:r>
             <w:r>
               <w:rPr>
@@ -825,7 +857,7 @@
               <w14:ligatures w14:val="standardContextual"/>
             </w:rPr>
           </w:pPr>
-          <w:hyperlink w:anchor="_Toc226837188" w:history="1">
+          <w:hyperlink w:anchor="_Toc227245225" w:history="1">
             <w:r>
               <w:rPr>
                 <w:rStyle w:val="Hyperlink"/>
@@ -871,7 +903,7 @@
                 <w:noProof/>
                 <w:webHidden/>
               </w:rPr>
-              <w:instrText xml:space="preserve"> PAGEREF _Toc226837188 \h </w:instrText>
+              <w:instrText xml:space="preserve"> PAGEREF _Toc227245225 \h </w:instrText>
             </w:r>
             <w:r>
               <w:rPr>
@@ -891,7 +923,7 @@
                 <w:noProof/>
                 <w:webHidden/>
               </w:rPr>
-              <w:t>3</w:t>
+              <w:t>4</w:t>
             </w:r>
             <w:r>
               <w:rPr>
@@ -915,7 +947,7 @@
               <w14:ligatures w14:val="standardContextual"/>
             </w:rPr>
           </w:pPr>
-          <w:hyperlink w:anchor="_Toc226837189" w:history="1">
+          <w:hyperlink w:anchor="_Toc227245226" w:history="1">
             <w:r>
               <w:rPr>
                 <w:rStyle w:val="Hyperlink"/>
@@ -961,7 +993,7 @@
                 <w:noProof/>
                 <w:webHidden/>
               </w:rPr>
-              <w:instrText xml:space="preserve"> PAGEREF _Toc226837189 \h </w:instrText>
+              <w:instrText xml:space="preserve"> PAGEREF _Toc227245226 \h </w:instrText>
             </w:r>
             <w:r>
               <w:rPr>
@@ -981,7 +1013,7 @@
                 <w:noProof/>
                 <w:webHidden/>
               </w:rPr>
-              <w:t>3</w:t>
+              <w:t>4</w:t>
             </w:r>
             <w:r>
               <w:rPr>
@@ -1005,7 +1037,7 @@
               <w14:ligatures w14:val="standardContextual"/>
             </w:rPr>
           </w:pPr>
-          <w:hyperlink w:anchor="_Toc226837190" w:history="1">
+          <w:hyperlink w:anchor="_Toc227245227" w:history="1">
             <w:r>
               <w:rPr>
                 <w:rStyle w:val="Hyperlink"/>
@@ -1051,7 +1083,7 @@
                 <w:noProof/>
                 <w:webHidden/>
               </w:rPr>
-              <w:instrText xml:space="preserve"> PAGEREF _Toc226837190 \h </w:instrText>
+              <w:instrText xml:space="preserve"> PAGEREF _Toc227245227 \h </w:instrText>
             </w:r>
             <w:r>
               <w:rPr>
@@ -1071,7 +1103,7 @@
                 <w:noProof/>
                 <w:webHidden/>
               </w:rPr>
-              <w:t>3</w:t>
+              <w:t>4</w:t>
             </w:r>
             <w:r>
               <w:rPr>
@@ -1095,7 +1127,7 @@
               <w14:ligatures w14:val="standardContextual"/>
             </w:rPr>
           </w:pPr>
-          <w:hyperlink w:anchor="_Toc226837191" w:history="1">
+          <w:hyperlink w:anchor="_Toc227245228" w:history="1">
             <w:r>
               <w:rPr>
                 <w:rStyle w:val="Hyperlink"/>
@@ -1141,7 +1173,7 @@
                 <w:noProof/>
                 <w:webHidden/>
               </w:rPr>
-              <w:instrText xml:space="preserve"> PAGEREF _Toc226837191 \h </w:instrText>
+              <w:instrText xml:space="preserve"> PAGEREF _Toc227245228 \h </w:instrText>
             </w:r>
             <w:r>
               <w:rPr>
@@ -1161,7 +1193,7 @@
                 <w:noProof/>
                 <w:webHidden/>
               </w:rPr>
-              <w:t>3</w:t>
+              <w:t>4</w:t>
             </w:r>
             <w:r>
               <w:rPr>
@@ -1185,7 +1217,7 @@
               <w14:ligatures w14:val="standardContextual"/>
             </w:rPr>
           </w:pPr>
-          <w:hyperlink w:anchor="_Toc226837192" w:history="1">
+          <w:hyperlink w:anchor="_Toc227245229" w:history="1">
             <w:r>
               <w:rPr>
                 <w:rStyle w:val="Hyperlink"/>
@@ -1233,7 +1265,7 @@
                 <w:noProof/>
                 <w:webHidden/>
               </w:rPr>
-              <w:instrText xml:space="preserve"> PAGEREF _Toc226837192 \h </w:instrText>
+              <w:instrText xml:space="preserve"> PAGEREF _Toc227245229 \h </w:instrText>
             </w:r>
             <w:r>
               <w:rPr>
@@ -1253,7 +1285,7 @@
                 <w:noProof/>
                 <w:webHidden/>
               </w:rPr>
-              <w:t>3</w:t>
+              <w:t>4</w:t>
             </w:r>
             <w:r>
               <w:rPr>
@@ -1277,7 +1309,7 @@
               <w14:ligatures w14:val="standardContextual"/>
             </w:rPr>
           </w:pPr>
-          <w:hyperlink w:anchor="_Toc226837193" w:history="1">
+          <w:hyperlink w:anchor="_Toc227245230" w:history="1">
             <w:r>
               <w:rPr>
                 <w:rStyle w:val="Hyperlink"/>
@@ -1323,7 +1355,7 @@
                 <w:noProof/>
                 <w:webHidden/>
               </w:rPr>
-              <w:instrText xml:space="preserve"> PAGEREF _Toc226837193 \h </w:instrText>
+              <w:instrText xml:space="preserve"> PAGEREF _Toc227245230 \h </w:instrText>
             </w:r>
             <w:r>
               <w:rPr>
@@ -1343,7 +1375,7 @@
                 <w:noProof/>
                 <w:webHidden/>
               </w:rPr>
-              <w:t>3</w:t>
+              <w:t>4</w:t>
             </w:r>
             <w:r>
               <w:rPr>
@@ -1367,7 +1399,7 @@
               <w14:ligatures w14:val="standardContextual"/>
             </w:rPr>
           </w:pPr>
-          <w:hyperlink w:anchor="_Toc226837195" w:history="1">
+          <w:hyperlink w:anchor="_Toc227245232" w:history="1">
             <w:r>
               <w:rPr>
                 <w:rStyle w:val="Hyperlink"/>
@@ -1413,7 +1445,7 @@
                 <w:noProof/>
                 <w:webHidden/>
               </w:rPr>
-              <w:instrText xml:space="preserve"> PAGEREF _Toc226837195 \h </w:instrText>
+              <w:instrText xml:space="preserve"> PAGEREF _Toc227245232 \h </w:instrText>
             </w:r>
             <w:r>
               <w:rPr>
@@ -1433,7 +1465,7 @@
                 <w:noProof/>
                 <w:webHidden/>
               </w:rPr>
-              <w:t>3</w:t>
+              <w:t>4</w:t>
             </w:r>
             <w:r>
               <w:rPr>
@@ -1457,10 +1489,11 @@
               <w14:ligatures w14:val="standardContextual"/>
             </w:rPr>
           </w:pPr>
-          <w:hyperlink w:anchor="_Toc226837196" w:history="1">
+          <w:hyperlink w:anchor="_Toc227245233" w:history="1">
             <w:r>
               <w:rPr>
                 <w:rStyle w:val="Hyperlink"/>
+                <w:rFonts w:ascii="Calibri Light" w:hAnsi="Calibri Light"/>
                 <w:b/>
                 <w:bCs/>
                 <w:noProof/>
@@ -1478,6 +1511,7 @@
             <w:r>
               <w:rPr>
                 <w:rStyle w:val="Hyperlink"/>
+                <w:rFonts w:ascii="Calibri Light" w:hAnsi="Calibri Light"/>
                 <w:b/>
                 <w:bCs/>
                 <w:noProof/>
@@ -1503,7 +1537,7 @@
                 <w:noProof/>
                 <w:webHidden/>
               </w:rPr>
-              <w:instrText xml:space="preserve"> PAGEREF _Toc226837196 \h </w:instrText>
+              <w:instrText xml:space="preserve"> PAGEREF _Toc227245233 \h </w:instrText>
             </w:r>
             <w:r>
               <w:rPr>
@@ -1523,7 +1557,99 @@
                 <w:noProof/>
                 <w:webHidden/>
               </w:rPr>
-              <w:t>3</w:t>
+              <w:t>4</w:t>
+            </w:r>
+            <w:r>
+              <w:rPr>
+                <w:noProof/>
+                <w:webHidden/>
+              </w:rPr>
+              <w:fldChar w:fldCharType="end"/>
+            </w:r>
+          </w:hyperlink>
+        </w:p>
+        <w:p>
+          <w:pPr>
+            <w:pStyle w:val="TOC3"/>
+            <w:tabs>
+              <w:tab w:val="left" w:pos="1440"/>
+              <w:tab w:val="right" w:leader="dot" w:pos="9350"/>
+            </w:tabs>
+            <w:rPr>
+              <w:rFonts w:asciiTheme="minorHAnsi" w:eastAsiaTheme="minorEastAsia" w:hAnsiTheme="minorHAnsi" w:cstheme="minorBidi"/>
+              <w:noProof/>
+              <w14:ligatures w14:val="standardContextual"/>
+            </w:rPr>
+          </w:pPr>
+          <w:hyperlink w:anchor="_Toc227245235" w:history="1">
+            <w:r>
+              <w:rPr>
+                <w:rStyle w:val="Hyperlink"/>
+                <w:rFonts w:ascii="Calibri Light" w:hAnsi="Calibri Light"/>
+                <w:b/>
+                <w:bCs/>
+                <w:noProof/>
+              </w:rPr>
+              <w:t>2.2.2</w:t>
+            </w:r>
+            <w:r>
+              <w:rPr>
+                <w:rFonts w:asciiTheme="minorHAnsi" w:eastAsiaTheme="minorEastAsia" w:hAnsiTheme="minorHAnsi" w:cstheme="minorBidi"/>
+                <w:noProof/>
+                <w14:ligatures w14:val="standardContextual"/>
+              </w:rPr>
+              <w:tab/>
+            </w:r>
+            <w:r>
+              <w:rPr>
+                <w:rStyle w:val="Hyperlink"/>
+                <w:rFonts w:ascii="Calibri Light" w:hAnsi="Calibri Light"/>
+                <w:b/>
+                <w:bCs/>
+                <w:noProof/>
+              </w:rPr>
+              <w:t>Korisnik se oldučuje na kupovinu svih komponenti iz trenutne konfiguracije</w:t>
+            </w:r>
+            <w:r>
+              <w:rPr>
+                <w:noProof/>
+                <w:webHidden/>
+              </w:rPr>
+              <w:tab/>
+            </w:r>
+            <w:r>
+              <w:rPr>
+                <w:noProof/>
+                <w:webHidden/>
+              </w:rPr>
+              <w:fldChar w:fldCharType="begin"/>
+            </w:r>
+            <w:r>
+              <w:rPr>
+                <w:noProof/>
+                <w:webHidden/>
+              </w:rPr>
+              <w:instrText xml:space="preserve"> PAGEREF _Toc227245235 \h </w:instrText>
+            </w:r>
+            <w:r>
+              <w:rPr>
+                <w:noProof/>
+                <w:webHidden/>
+              </w:rPr>
+            </w:r>
+            <w:r>
+              <w:rPr>
+                <w:noProof/>
+                <w:webHidden/>
+              </w:rPr>
+              <w:fldChar w:fldCharType="separate"/>
+            </w:r>
+            <w:r>
+              <w:rPr>
+                <w:noProof/>
+                <w:webHidden/>
+              </w:rPr>
+              <w:t>5</w:t>
             </w:r>
             <w:r>
               <w:rPr>
@@ -1547,7 +1673,7 @@
               <w14:ligatures w14:val="standardContextual"/>
             </w:rPr>
           </w:pPr>
-          <w:hyperlink w:anchor="_Toc226837198" w:history="1">
+          <w:hyperlink w:anchor="_Toc227245237" w:history="1">
             <w:r>
               <w:rPr>
                 <w:rStyle w:val="Hyperlink"/>
@@ -1593,7 +1719,7 @@
                 <w:noProof/>
                 <w:webHidden/>
               </w:rPr>
-              <w:instrText xml:space="preserve"> PAGEREF _Toc226837198 \h </w:instrText>
+              <w:instrText xml:space="preserve"> PAGEREF _Toc227245237 \h </w:instrText>
             </w:r>
             <w:r>
               <w:rPr>
@@ -1613,7 +1739,7 @@
                 <w:noProof/>
                 <w:webHidden/>
               </w:rPr>
-              <w:t>3</w:t>
+              <w:t>5</w:t>
             </w:r>
             <w:r>
               <w:rPr>
@@ -1637,7 +1763,7 @@
               <w14:ligatures w14:val="standardContextual"/>
             </w:rPr>
           </w:pPr>
-          <w:hyperlink w:anchor="_Toc226837199" w:history="1">
+          <w:hyperlink w:anchor="_Toc227245238" w:history="1">
             <w:r>
               <w:rPr>
                 <w:rStyle w:val="Hyperlink"/>
@@ -1683,7 +1809,7 @@
                 <w:noProof/>
                 <w:webHidden/>
               </w:rPr>
-              <w:instrText xml:space="preserve"> PAGEREF _Toc226837199 \h </w:instrText>
+              <w:instrText xml:space="preserve"> PAGEREF _Toc227245238 \h </w:instrText>
             </w:r>
             <w:r>
               <w:rPr>
@@ -1703,7 +1829,7 @@
                 <w:noProof/>
                 <w:webHidden/>
               </w:rPr>
-              <w:t>4</w:t>
+              <w:t>5</w:t>
             </w:r>
             <w:r>
               <w:rPr>
@@ -1727,7 +1853,7 @@
               <w14:ligatures w14:val="standardContextual"/>
             </w:rPr>
           </w:pPr>
-          <w:hyperlink w:anchor="_Toc226837200" w:history="1">
+          <w:hyperlink w:anchor="_Toc227245239" w:history="1">
             <w:r>
               <w:rPr>
                 <w:rStyle w:val="Hyperlink"/>
@@ -1773,7 +1899,7 @@
                 <w:noProof/>
                 <w:webHidden/>
               </w:rPr>
-              <w:instrText xml:space="preserve"> PAGEREF _Toc226837200 \h </w:instrText>
+              <w:instrText xml:space="preserve"> PAGEREF _Toc227245239 \h </w:instrText>
             </w:r>
             <w:r>
               <w:rPr>
@@ -1793,7 +1919,7 @@
                 <w:noProof/>
                 <w:webHidden/>
               </w:rPr>
-              <w:t>4</w:t>
+              <w:t>5</w:t>
             </w:r>
             <w:r>
               <w:rPr>
@@ -1827,7 +1953,7 @@
         <w:br w:type="page"/>
       </w:r>
       <w:bookmarkStart w:id="1" w:name="_Toc209864993"/>
-      <w:bookmarkStart w:id="2" w:name="_Toc226837187"/>
+      <w:bookmarkStart w:id="2" w:name="_Toc227245224"/>
       <w:r>
         <w:rPr>
           <w:b/>
@@ -1860,7 +1986,7 @@
         </w:rPr>
       </w:pPr>
       <w:bookmarkStart w:id="3" w:name="_Toc209864994"/>
-      <w:bookmarkStart w:id="4" w:name="_Toc226837188"/>
+      <w:bookmarkStart w:id="4" w:name="_Toc227245225"/>
       <w:r>
         <w:rPr>
           <w:rStyle w:val="Heading2Char"/>
@@ -1906,7 +2032,7 @@
         </w:rPr>
       </w:pPr>
       <w:bookmarkStart w:id="5" w:name="_Toc209864995"/>
-      <w:bookmarkStart w:id="6" w:name="_Toc226837189"/>
+      <w:bookmarkStart w:id="6" w:name="_Toc227245226"/>
       <w:r>
         <w:rPr>
           <w:rStyle w:val="Heading2Char"/>
@@ -1952,7 +2078,7 @@
         </w:rPr>
       </w:pPr>
       <w:bookmarkStart w:id="7" w:name="_Toc209864996"/>
-      <w:bookmarkStart w:id="8" w:name="_Toc226837190"/>
+      <w:bookmarkStart w:id="8" w:name="_Toc227245227"/>
       <w:r>
         <w:rPr>
           <w:rStyle w:val="Heading2Char"/>
@@ -2046,7 +2172,7 @@
         </w:rPr>
       </w:pPr>
       <w:bookmarkStart w:id="9" w:name="_Toc209864997"/>
-      <w:bookmarkStart w:id="10" w:name="_Toc226837191"/>
+      <w:bookmarkStart w:id="10" w:name="_Toc227245228"/>
       <w:r>
         <w:rPr>
           <w:b/>
@@ -2074,14 +2200,14 @@
         <w:tblLook w:val="04A0" w:firstRow="1" w:lastRow="0" w:firstColumn="1" w:lastColumn="0" w:noHBand="0" w:noVBand="1"/>
       </w:tblPr>
       <w:tblGrid>
-        <w:gridCol w:w="1127"/>
-        <w:gridCol w:w="3830"/>
+        <w:gridCol w:w="1126"/>
+        <w:gridCol w:w="3831"/>
         <w:gridCol w:w="4393"/>
       </w:tblGrid>
       <w:tr>
         <w:tc>
           <w:tcPr>
-            <w:tcW w:w="1127" w:type="dxa"/>
+            <w:tcW w:w="1126" w:type="dxa"/>
             <w:tcBorders>
               <w:top w:val="single" w:sz="4" w:space="0" w:color="000000"/>
               <w:left w:val="single" w:sz="4" w:space="0" w:color="000000"/>
@@ -2111,7 +2237,7 @@
         </w:tc>
         <w:tc>
           <w:tcPr>
-            <w:tcW w:w="3830" w:type="dxa"/>
+            <w:tcW w:w="3831" w:type="dxa"/>
             <w:tcBorders>
               <w:top w:val="single" w:sz="4" w:space="0" w:color="000000"/>
               <w:left w:val="single" w:sz="4" w:space="0" w:color="000000"/>
@@ -2173,7 +2299,7 @@
       <w:tr>
         <w:tc>
           <w:tcPr>
-            <w:tcW w:w="1127" w:type="dxa"/>
+            <w:tcW w:w="1126" w:type="dxa"/>
             <w:tcBorders>
               <w:top w:val="single" w:sz="4" w:space="0" w:color="000000"/>
               <w:left w:val="single" w:sz="4" w:space="0" w:color="000000"/>
@@ -2194,7 +2320,7 @@
         </w:tc>
         <w:tc>
           <w:tcPr>
-            <w:tcW w:w="3830" w:type="dxa"/>
+            <w:tcW w:w="3831" w:type="dxa"/>
             <w:tcBorders>
               <w:top w:val="single" w:sz="4" w:space="0" w:color="000000"/>
               <w:left w:val="single" w:sz="4" w:space="0" w:color="000000"/>
@@ -2238,7 +2364,7 @@
       <w:tr>
         <w:tc>
           <w:tcPr>
-            <w:tcW w:w="1127" w:type="dxa"/>
+            <w:tcW w:w="1126" w:type="dxa"/>
             <w:tcBorders>
               <w:top w:val="single" w:sz="4" w:space="0" w:color="000000"/>
               <w:left w:val="single" w:sz="4" w:space="0" w:color="000000"/>
@@ -2259,7 +2385,7 @@
         </w:tc>
         <w:tc>
           <w:tcPr>
-            <w:tcW w:w="3830" w:type="dxa"/>
+            <w:tcW w:w="3831" w:type="dxa"/>
             <w:tcBorders>
               <w:top w:val="single" w:sz="4" w:space="0" w:color="000000"/>
               <w:left w:val="single" w:sz="4" w:space="0" w:color="000000"/>
@@ -2303,7 +2429,7 @@
       <w:tr>
         <w:tc>
           <w:tcPr>
-            <w:tcW w:w="1127" w:type="dxa"/>
+            <w:tcW w:w="1126" w:type="dxa"/>
             <w:tcBorders>
               <w:top w:val="single" w:sz="4" w:space="0" w:color="000000"/>
               <w:left w:val="single" w:sz="4" w:space="0" w:color="000000"/>
@@ -2324,7 +2450,7 @@
         </w:tc>
         <w:tc>
           <w:tcPr>
-            <w:tcW w:w="3830" w:type="dxa"/>
+            <w:tcW w:w="3831" w:type="dxa"/>
             <w:tcBorders>
               <w:top w:val="single" w:sz="4" w:space="0" w:color="000000"/>
               <w:left w:val="single" w:sz="4" w:space="0" w:color="000000"/>
@@ -2368,7 +2494,7 @@
       <w:tr>
         <w:tc>
           <w:tcPr>
-            <w:tcW w:w="1127" w:type="dxa"/>
+            <w:tcW w:w="1126" w:type="dxa"/>
             <w:tcBorders>
               <w:top w:val="single" w:sz="4" w:space="0" w:color="000000"/>
               <w:left w:val="single" w:sz="4" w:space="0" w:color="000000"/>
@@ -2389,7 +2515,7 @@
         </w:tc>
         <w:tc>
           <w:tcPr>
-            <w:tcW w:w="3830" w:type="dxa"/>
+            <w:tcW w:w="3831" w:type="dxa"/>
             <w:tcBorders>
               <w:top w:val="single" w:sz="4" w:space="0" w:color="000000"/>
               <w:left w:val="single" w:sz="4" w:space="0" w:color="000000"/>
@@ -2451,7 +2577,7 @@
         </w:rPr>
       </w:pPr>
       <w:bookmarkStart w:id="11" w:name="_Toc209864998"/>
-      <w:bookmarkStart w:id="12" w:name="_Toc226837192"/>
+      <w:bookmarkStart w:id="12" w:name="_Toc227245229"/>
       <w:r>
         <w:rPr>
           <w:b/>
@@ -2494,7 +2620,7 @@
         </w:rPr>
       </w:pPr>
       <w:bookmarkStart w:id="13" w:name="_Toc209864999"/>
-      <w:bookmarkStart w:id="14" w:name="_Toc226837193"/>
+      <w:bookmarkStart w:id="14" w:name="_Toc227245230"/>
       <w:r>
         <w:rPr>
           <w:rStyle w:val="Heading2Char"/>
@@ -2527,8 +2653,7 @@
       <w:bookmarkEnd w:id="14"/>
     </w:p>
     <w:p>
-      <w:bookmarkStart w:id="15" w:name="_Toc226837146"/>
-      <w:bookmarkStart w:id="16" w:name="_Toc226837194"/>
+      <w:bookmarkStart w:id="15" w:name="_Toc227245231"/>
       <w:r>
         <w:rPr>
           <w:rStyle w:val="Heading2Char"/>
@@ -2537,10 +2662,9 @@
           <w:szCs w:val="24"/>
           <w:lang w:val="sr-Latn-RS"/>
         </w:rPr>
-        <w:t>Pored svake komponente, bilo na stranici za pretragu, bilo na stranici pregleda ternutne konfiguracije, pored svake komponente stoji dugme za kupovinu. Pritisak tog dugmeta vodi korisnika na sajt prodavca koji tu komponentu prodaje.</w:t>
+        <w:t>Na stranici svake komponente postoji sekcija sa prodavcima, i pored svakog stoji dugme kupi. Pritisak tog dugmeta korisnika vodi do sajta prodavca koji prodaje komponentu. Takodje je moguce pritisnuti dugme za kupovinu svih komponenti koje se trenutno nalaze u konfiguraciji.</w:t>
       </w:r>
       <w:bookmarkEnd w:id="15"/>
-      <w:bookmarkEnd w:id="16"/>
     </w:p>
     <w:p>
       <w:pPr>
@@ -2550,8 +2674,8 @@
           <w:lang w:val="sr-Latn-RS"/>
         </w:rPr>
       </w:pPr>
-      <w:bookmarkStart w:id="17" w:name="_Toc209865000"/>
-      <w:bookmarkStart w:id="18" w:name="_Toc226837195"/>
+      <w:bookmarkStart w:id="16" w:name="_Toc209865000"/>
+      <w:bookmarkStart w:id="17" w:name="_Toc227245232"/>
       <w:r>
         <w:rPr>
           <w:rStyle w:val="Heading2Char"/>
@@ -2571,71 +2695,69 @@
         <w:tab/>
         <w:t>Tok događaja</w:t>
       </w:r>
+      <w:bookmarkEnd w:id="16"/>
       <w:bookmarkEnd w:id="17"/>
+    </w:p>
+    <w:p>
+      <w:pPr>
+        <w:pStyle w:val="Heading3"/>
+        <w:rPr>
+          <w:b/>
+          <w:bCs/>
+          <w:color w:val="auto"/>
+          <w:sz w:val="24"/>
+          <w:szCs w:val="24"/>
+        </w:rPr>
+      </w:pPr>
+      <w:bookmarkStart w:id="18" w:name="_Toc227245233"/>
+      <w:r>
+        <w:rPr>
+          <w:rStyle w:val="Heading2Char"/>
+          <w:b/>
+          <w:bCs/>
+          <w:color w:val="auto"/>
+          <w:sz w:val="24"/>
+          <w:szCs w:val="24"/>
+        </w:rPr>
+        <w:t>2.2.1</w:t>
+      </w:r>
+      <w:r>
+        <w:rPr>
+          <w:rStyle w:val="Heading2Char"/>
+          <w:b/>
+          <w:bCs/>
+          <w:color w:val="auto"/>
+          <w:sz w:val="24"/>
+          <w:szCs w:val="24"/>
+        </w:rPr>
+        <w:tab/>
+      </w:r>
+      <w:r>
+        <w:rPr>
+          <w:rStyle w:val="Heading2Char"/>
+          <w:b/>
+          <w:bCs/>
+          <w:color w:val="auto"/>
+          <w:sz w:val="24"/>
+          <w:szCs w:val="24"/>
+          <w:u w:val="single"/>
+        </w:rPr>
+        <w:t>Korisnik se odlučuje na kupovinu komponente</w:t>
+      </w:r>
       <w:bookmarkEnd w:id="18"/>
     </w:p>
     <w:p>
       <w:pPr>
-        <w:pStyle w:val="Heading3"/>
-        <w:rPr>
-          <w:b/>
-          <w:bCs/>
-          <w:color w:val="auto"/>
-          <w:sz w:val="24"/>
-          <w:szCs w:val="24"/>
-        </w:rPr>
-      </w:pPr>
-      <w:bookmarkStart w:id="19" w:name="_Toc226837196"/>
-      <w:r>
-        <w:rPr>
-          <w:rStyle w:val="Heading2Char"/>
-          <w:rFonts w:ascii="Calibri" w:hAnsi="Calibri"/>
-          <w:b/>
-          <w:bCs/>
-          <w:color w:val="auto"/>
-          <w:sz w:val="24"/>
-          <w:szCs w:val="24"/>
-        </w:rPr>
-        <w:t>2.2.1</w:t>
-      </w:r>
-      <w:r>
-        <w:rPr>
-          <w:rStyle w:val="Heading2Char"/>
-          <w:rFonts w:ascii="Calibri" w:hAnsi="Calibri"/>
-          <w:b/>
-          <w:bCs/>
-          <w:color w:val="auto"/>
-          <w:sz w:val="24"/>
-          <w:szCs w:val="24"/>
-        </w:rPr>
-        <w:tab/>
-      </w:r>
-      <w:r>
-        <w:rPr>
-          <w:rStyle w:val="Heading2Char"/>
-          <w:rFonts w:ascii="Calibri" w:hAnsi="Calibri"/>
-          <w:b/>
-          <w:bCs/>
-          <w:color w:val="auto"/>
-          <w:sz w:val="24"/>
-          <w:szCs w:val="24"/>
-          <w:u w:val="single"/>
-        </w:rPr>
-        <w:t>Korisnik se odlučuje na kupovinu komponente</w:t>
-      </w:r>
-      <w:bookmarkEnd w:id="19"/>
-    </w:p>
-    <w:p>
-      <w:pPr>
         <w:rPr>
           <w:sz w:val="22"/>
           <w:szCs w:val="22"/>
           <w:lang w:val="sr-Latn-RS"/>
         </w:rPr>
       </w:pPr>
-      <w:bookmarkStart w:id="20" w:name="_Toc226745009"/>
+      <w:bookmarkStart w:id="19" w:name="_Toc226745009"/>
+      <w:bookmarkStart w:id="20" w:name="_Toc226837197"/>
       <w:bookmarkStart w:id="21" w:name="_Toc226837149"/>
-      <w:bookmarkStart w:id="22" w:name="_Toc226837197"/>
+      <w:bookmarkStart w:id="22" w:name="_Toc227245234"/>
       <w:r>
         <w:rPr>
           <w:rStyle w:val="Heading2Char"/>
@@ -2645,7 +2767,7 @@
         </w:rPr>
         <w:t xml:space="preserve">1. </w:t>
       </w:r>
-      <w:bookmarkEnd w:id="20"/>
+      <w:bookmarkEnd w:id="19"/>
       <w:r>
         <w:rPr>
           <w:rStyle w:val="Heading2Char"/>
@@ -2653,7 +2775,7 @@
           <w:sz w:val="24"/>
           <w:szCs w:val="24"/>
         </w:rPr>
-        <w:t>Korisnik je izvršio pretragu komponente (definisanu u dokumentu 5.3 SSU) ili se nalazi na stranici pregleda trenutne konfiguracije.</w:t>
+        <w:t>Korisnik je izvršio pretragu komponente (definisanu u dokumentu 5.3 SSU) i posetio je stranicu željene komponente.</w:t>
       </w:r>
       <w:r>
         <w:rPr>
@@ -2663,7 +2785,7 @@
           <w:szCs w:val="24"/>
         </w:rPr>
         <w:br/>
-        <w:t>2. Korisnik pritiska dugme za kupovinu komponente.</w:t>
+        <w:t>2. Na dnu stranice postoji lista prodavaca koji prodaju tu komponentu, i pored svakog stoji dugme kupi. Korisnik pritiska dugme kupi pored željenog prodavca.</w:t>
       </w:r>
       <w:r>
         <w:rPr>
@@ -2675,11 +2797,77 @@
         <w:br/>
         <w:t>3. U posebnom tabu unutar korisnikovog pretraživača se otvara sajt prodavca, konkretno stranica na kojoj se vidi prikaz odabrane komponente.</w:t>
       </w:r>
+      <w:bookmarkEnd w:id="20"/>
       <w:bookmarkEnd w:id="21"/>
       <w:bookmarkEnd w:id="22"/>
     </w:p>
     <w:p>
       <w:pPr>
+        <w:pStyle w:val="Heading3"/>
+      </w:pPr>
+      <w:bookmarkStart w:id="23" w:name="_Toc227245235"/>
+      <w:r>
+        <w:rPr>
+          <w:rStyle w:val="Heading2Char"/>
+          <w:b/>
+          <w:bCs/>
+          <w:color w:val="000000" w:themeColor="dark1"/>
+          <w:sz w:val="24"/>
+          <w:szCs w:val="24"/>
+        </w:rPr>
+        <w:lastRenderedPageBreak/>
+        <w:t>2.2.2</w:t>
+      </w:r>
+      <w:r>
+        <w:rPr>
+          <w:rStyle w:val="Heading2Char"/>
+          <w:b/>
+          <w:bCs/>
+          <w:color w:val="000000" w:themeColor="dark1"/>
+          <w:sz w:val="24"/>
+          <w:szCs w:val="24"/>
+        </w:rPr>
+        <w:tab/>
+      </w:r>
+      <w:r>
+        <w:rPr>
+          <w:rStyle w:val="Heading2Char"/>
+          <w:b/>
+          <w:bCs/>
+          <w:color w:val="000000" w:themeColor="dark1"/>
+          <w:sz w:val="24"/>
+          <w:szCs w:val="24"/>
+          <w:u w:val="single"/>
+        </w:rPr>
+        <w:t>Korisnik se oldučuje na kupovinu svih komponenti iz trenutne konfiguracije</w:t>
+      </w:r>
+      <w:bookmarkEnd w:id="23"/>
+    </w:p>
+    <w:p>
+      <w:bookmarkStart w:id="24" w:name="_Toc227245236"/>
+      <w:r>
+        <w:rPr>
+          <w:rStyle w:val="Heading2Char"/>
+          <w:color w:val="000000" w:themeColor="dark1"/>
+          <w:sz w:val="24"/>
+          <w:szCs w:val="24"/>
+        </w:rPr>
+        <w:t>1. Korisnik se nalazi na stranici pregleda trenutne konfiguracije i pritiska dugme za kupovinu svih komponenti unutar trenutne konfiguracije.</w:t>
+      </w:r>
+      <w:r>
+        <w:rPr>
+          <w:rStyle w:val="Heading2Char"/>
+          <w:color w:val="000000" w:themeColor="dark1"/>
+          <w:sz w:val="24"/>
+          <w:szCs w:val="24"/>
+        </w:rPr>
+        <w:br/>
+        <w:t>2. 3. U posebnim tabovima unutar korisnikovog pretraživača se otvaraju sajtovi prodavca, konkretno stranice na kojoj se vide prikazi odabranih komponenti, i to onih prodavaca kod kojih je ta komponenta najjeftinija.</w:t>
+      </w:r>
+      <w:bookmarkEnd w:id="24"/>
+    </w:p>
+    <w:p>
+      <w:pPr>
         <w:rPr>
           <w:b/>
           <w:bCs/>
@@ -2694,8 +2882,8 @@
         </w:rPr>
         <w:br/>
       </w:r>
-      <w:bookmarkStart w:id="23" w:name="_Toc209865006"/>
-      <w:bookmarkStart w:id="24" w:name="_Toc226837198"/>
+      <w:bookmarkStart w:id="25" w:name="_Toc209865006"/>
+      <w:bookmarkStart w:id="26" w:name="_Toc227245237"/>
       <w:r>
         <w:rPr>
           <w:rStyle w:val="Heading2Char"/>
@@ -2715,8 +2903,8 @@
         <w:tab/>
         <w:t>Posebni zahtevi</w:t>
       </w:r>
-      <w:bookmarkEnd w:id="23"/>
-      <w:bookmarkEnd w:id="24"/>
+      <w:bookmarkEnd w:id="25"/>
+      <w:bookmarkEnd w:id="26"/>
       <w:r>
         <w:rPr>
           <w:rStyle w:val="Heading2Char"/>
@@ -2742,8 +2930,8 @@
           <w:color w:val="000000" w:themeColor="dark1"/>
         </w:rPr>
       </w:pPr>
-      <w:bookmarkStart w:id="25" w:name="_Toc209865007"/>
-      <w:bookmarkStart w:id="26" w:name="_Toc226837199"/>
+      <w:bookmarkStart w:id="27" w:name="_Toc209865007"/>
+      <w:bookmarkStart w:id="28" w:name="_Toc227245238"/>
       <w:r>
         <w:rPr>
           <w:rStyle w:val="Heading2Char"/>
@@ -2751,7 +2939,6 @@
           <w:bCs/>
           <w:color w:val="auto"/>
         </w:rPr>
-        <w:lastRenderedPageBreak/>
         <w:t xml:space="preserve">2.4 </w:t>
       </w:r>
       <w:r>
@@ -2764,7 +2951,7 @@
         <w:tab/>
         <w:t>Preduslovi</w:t>
       </w:r>
-      <w:bookmarkEnd w:id="25"/>
+      <w:bookmarkEnd w:id="27"/>
       <w:r>
         <w:rPr>
           <w:rStyle w:val="Heading2Char"/>
@@ -2784,7 +2971,7 @@
         </w:rPr>
         <w:t>Korisnik mora biti ulogovan.</w:t>
       </w:r>
-      <w:bookmarkEnd w:id="26"/>
+      <w:bookmarkEnd w:id="28"/>
     </w:p>
     <w:p>
       <w:pPr>
@@ -2795,8 +2982,8 @@
           <w:color w:val="auto"/>
         </w:rPr>
       </w:pPr>
-      <w:bookmarkStart w:id="27" w:name="_Toc209865008"/>
-      <w:bookmarkStart w:id="28" w:name="_Toc226837200"/>
+      <w:bookmarkStart w:id="29" w:name="_Toc209865008"/>
+      <w:bookmarkStart w:id="30" w:name="_Toc227245239"/>
       <w:r>
         <w:rPr>
           <w:rStyle w:val="Heading2Char"/>
@@ -2816,8 +3003,8 @@
         <w:tab/>
         <w:t>Posledice</w:t>
       </w:r>
-      <w:bookmarkEnd w:id="27"/>
-      <w:bookmarkEnd w:id="28"/>
+      <w:bookmarkEnd w:id="29"/>
+      <w:bookmarkEnd w:id="30"/>
     </w:p>
     <w:p>
       <w:r>

</xml_diff>